<commit_message>
updated resume and cover letter
</commit_message>
<xml_diff>
--- a/input/AnschreibenRaw.docx
+++ b/input/AnschreibenRaw.docx
@@ -107,6 +107,7 @@
           <w:color w:val="auto"/>
           <w:sz w:val="24"/>
           <w:szCs w:val="24"/>
+          <w:lang w:val="de-DE"/>
         </w:rPr>
       </w:pPr>
       <w:r>
@@ -115,6 +116,7 @@
           <w:color w:val="auto"/>
           <w:sz w:val="24"/>
           <w:szCs w:val="24"/>
+          <w:lang w:val="de-DE"/>
         </w:rPr>
         <w:t>Nürnberger Str</w:t>
       </w:r>
@@ -124,6 +126,7 @@
           <w:color w:val="auto"/>
           <w:sz w:val="24"/>
           <w:szCs w:val="24"/>
+          <w:lang w:val="de-DE"/>
         </w:rPr>
         <w:t xml:space="preserve">. </w:t>
       </w:r>
@@ -133,6 +136,7 @@
           <w:color w:val="auto"/>
           <w:sz w:val="24"/>
           <w:szCs w:val="24"/>
+          <w:lang w:val="de-DE"/>
         </w:rPr>
         <w:t>54</w:t>
       </w:r>
@@ -142,6 +146,7 @@
           <w:color w:val="auto"/>
           <w:sz w:val="24"/>
           <w:szCs w:val="24"/>
+          <w:lang w:val="de-DE"/>
         </w:rPr>
         <w:t>,</w:t>
       </w:r>
@@ -151,6 +156,7 @@
           <w:color w:val="auto"/>
           <w:sz w:val="24"/>
           <w:szCs w:val="24"/>
+          <w:lang w:val="de-DE"/>
         </w:rPr>
         <w:t xml:space="preserve"> 8505</w:t>
       </w:r>
@@ -160,6 +166,7 @@
           <w:color w:val="auto"/>
           <w:sz w:val="24"/>
           <w:szCs w:val="24"/>
+          <w:lang w:val="de-DE"/>
         </w:rPr>
         <w:t>5</w:t>
       </w:r>
@@ -169,6 +176,7 @@
           <w:color w:val="auto"/>
           <w:sz w:val="24"/>
           <w:szCs w:val="24"/>
+          <w:lang w:val="de-DE"/>
         </w:rPr>
         <w:t>,</w:t>
       </w:r>
@@ -178,6 +186,7 @@
           <w:color w:val="auto"/>
           <w:sz w:val="24"/>
           <w:szCs w:val="24"/>
+          <w:lang w:val="de-DE"/>
         </w:rPr>
         <w:t xml:space="preserve"> Ingolstadt</w:t>
       </w:r>
@@ -187,6 +196,7 @@
           <w:color w:val="auto"/>
           <w:sz w:val="24"/>
           <w:szCs w:val="24"/>
+          <w:lang w:val="de-DE"/>
         </w:rPr>
         <w:t xml:space="preserve"> |</w:t>
       </w:r>
@@ -196,6 +206,7 @@
           <w:color w:val="auto"/>
           <w:sz w:val="24"/>
           <w:szCs w:val="24"/>
+          <w:lang w:val="de-DE"/>
         </w:rPr>
         <w:t xml:space="preserve"> </w:t>
       </w:r>
@@ -206,6 +217,7 @@
             <w:rFonts w:eastAsiaTheme="minorEastAsia" w:cstheme="majorHAnsi"/>
             <w:sz w:val="24"/>
             <w:szCs w:val="24"/>
+            <w:lang w:val="de-DE"/>
           </w:rPr>
           <w:t>vignesh.sundaramahalingam@gmail.com</w:t>
         </w:r>
@@ -216,11 +228,18 @@
           <w:color w:val="auto"/>
           <w:sz w:val="24"/>
           <w:szCs w:val="24"/>
+          <w:lang w:val="de-DE"/>
         </w:rPr>
         <w:t xml:space="preserve"> |+491792573336</w:t>
       </w:r>
     </w:p>
-    <w:p/>
+    <w:p>
+      <w:pPr>
+        <w:rPr>
+          <w:lang w:val="de-DE"/>
+        </w:rPr>
+      </w:pPr>
+    </w:p>
     <w:p>
       <w:pPr>
         <w:tabs>
@@ -231,8 +250,9 @@
         <w:jc w:val="both"/>
         <w:rPr>
           <w:rFonts w:asciiTheme="majorHAnsi" w:hAnsiTheme="majorHAnsi" w:cstheme="majorHAnsi"/>
-          <w:sz w:val="24"/>
-          <w:szCs w:val="24"/>
+          <w:sz w:val="28"/>
+          <w:szCs w:val="28"/>
+          <w:lang w:val="de-DE"/>
         </w:rPr>
       </w:pPr>
     </w:p>
@@ -246,71 +266,80 @@
         <w:jc w:val="right"/>
         <w:rPr>
           <w:rFonts w:asciiTheme="majorHAnsi" w:hAnsiTheme="majorHAnsi" w:cstheme="majorHAnsi"/>
-          <w:sz w:val="24"/>
-          <w:szCs w:val="24"/>
-        </w:rPr>
-      </w:pPr>
-      <w:r>
-        <w:rPr>
-          <w:rFonts w:asciiTheme="majorHAnsi" w:hAnsiTheme="majorHAnsi" w:cstheme="majorHAnsi"/>
-          <w:sz w:val="24"/>
-          <w:szCs w:val="24"/>
+          <w:sz w:val="28"/>
+          <w:szCs w:val="28"/>
+          <w:lang w:val="de-DE"/>
+        </w:rPr>
+      </w:pPr>
+      <w:r>
+        <w:rPr>
+          <w:rFonts w:asciiTheme="majorHAnsi" w:hAnsiTheme="majorHAnsi" w:cstheme="majorHAnsi"/>
+          <w:sz w:val="28"/>
+          <w:szCs w:val="28"/>
+          <w:lang w:val="de-DE"/>
         </w:rPr>
         <w:tab/>
       </w:r>
       <w:r>
         <w:rPr>
           <w:rFonts w:asciiTheme="majorHAnsi" w:hAnsiTheme="majorHAnsi" w:cstheme="majorHAnsi"/>
-          <w:sz w:val="24"/>
-          <w:szCs w:val="24"/>
+          <w:sz w:val="28"/>
+          <w:szCs w:val="28"/>
+          <w:lang w:val="de-DE"/>
         </w:rPr>
         <w:tab/>
       </w:r>
       <w:r>
         <w:rPr>
           <w:rFonts w:asciiTheme="majorHAnsi" w:hAnsiTheme="majorHAnsi" w:cstheme="majorHAnsi"/>
-          <w:sz w:val="24"/>
-          <w:szCs w:val="24"/>
+          <w:sz w:val="28"/>
+          <w:szCs w:val="28"/>
+          <w:lang w:val="de-DE"/>
         </w:rPr>
         <w:tab/>
       </w:r>
       <w:r>
         <w:rPr>
           <w:rFonts w:asciiTheme="majorHAnsi" w:hAnsiTheme="majorHAnsi" w:cstheme="majorHAnsi"/>
-          <w:sz w:val="24"/>
-          <w:szCs w:val="24"/>
+          <w:sz w:val="28"/>
+          <w:szCs w:val="28"/>
+          <w:lang w:val="de-DE"/>
         </w:rPr>
         <w:tab/>
       </w:r>
       <w:r>
         <w:rPr>
           <w:rFonts w:asciiTheme="majorHAnsi" w:hAnsiTheme="majorHAnsi" w:cstheme="majorHAnsi"/>
-          <w:sz w:val="24"/>
-          <w:szCs w:val="24"/>
+          <w:sz w:val="28"/>
+          <w:szCs w:val="28"/>
+          <w:lang w:val="de-DE"/>
         </w:rPr>
         <w:tab/>
       </w:r>
       <w:r>
         <w:rPr>
           <w:rFonts w:asciiTheme="majorHAnsi" w:hAnsiTheme="majorHAnsi" w:cstheme="majorHAnsi"/>
-          <w:sz w:val="24"/>
-          <w:szCs w:val="24"/>
+          <w:sz w:val="28"/>
+          <w:szCs w:val="28"/>
+          <w:lang w:val="de-DE"/>
         </w:rPr>
         <w:tab/>
       </w:r>
       <w:r>
         <w:rPr>
           <w:rFonts w:asciiTheme="majorHAnsi" w:hAnsiTheme="majorHAnsi" w:cstheme="majorHAnsi"/>
-          <w:sz w:val="24"/>
-          <w:szCs w:val="24"/>
+          <w:sz w:val="28"/>
+          <w:szCs w:val="28"/>
+          <w:lang w:val="de-DE"/>
         </w:rPr>
         <w:tab/>
       </w:r>
       <w:r>
         <w:rPr>
           <w:rFonts w:asciiTheme="majorHAnsi" w:hAnsiTheme="majorHAnsi" w:cstheme="majorHAnsi"/>
-          <w:sz w:val="24"/>
-          <w:szCs w:val="24"/>
+          <w:sz w:val="28"/>
+          <w:szCs w:val="28"/>
+          <w:lang w:val="de-DE"/>
         </w:rPr>
         <w:tab/>
         <w:t xml:space="preserve">   </w:t>
@@ -318,16 +347,18 @@
       <w:r>
         <w:rPr>
           <w:rFonts w:asciiTheme="majorHAnsi" w:hAnsiTheme="majorHAnsi" w:cstheme="majorHAnsi"/>
-          <w:sz w:val="24"/>
-          <w:szCs w:val="24"/>
+          <w:sz w:val="28"/>
+          <w:szCs w:val="28"/>
+          <w:lang w:val="de-DE"/>
         </w:rPr>
         <w:t>Ingolstadt</w:t>
       </w:r>
       <w:r>
         <w:rPr>
           <w:rFonts w:asciiTheme="majorHAnsi" w:hAnsiTheme="majorHAnsi" w:cstheme="majorHAnsi"/>
-          <w:sz w:val="24"/>
-          <w:szCs w:val="24"/>
+          <w:sz w:val="28"/>
+          <w:szCs w:val="28"/>
+          <w:lang w:val="de-DE"/>
         </w:rPr>
         <w:t>,</w:t>
       </w:r>
@@ -342,16 +373,16 @@
         <w:jc w:val="right"/>
         <w:rPr>
           <w:rFonts w:asciiTheme="majorHAnsi" w:hAnsiTheme="majorHAnsi" w:cstheme="majorHAnsi"/>
-          <w:sz w:val="24"/>
-          <w:szCs w:val="24"/>
-          <w:lang w:val="de-DE"/>
-        </w:rPr>
-      </w:pPr>
-      <w:r>
-        <w:rPr>
-          <w:rFonts w:asciiTheme="majorHAnsi" w:hAnsiTheme="majorHAnsi" w:cstheme="majorHAnsi"/>
-          <w:sz w:val="24"/>
-          <w:szCs w:val="24"/>
+          <w:sz w:val="28"/>
+          <w:szCs w:val="28"/>
+          <w:lang w:val="de-DE"/>
+        </w:rPr>
+      </w:pPr>
+      <w:r>
+        <w:rPr>
+          <w:rFonts w:asciiTheme="majorHAnsi" w:hAnsiTheme="majorHAnsi" w:cstheme="majorHAnsi"/>
+          <w:sz w:val="28"/>
+          <w:szCs w:val="28"/>
           <w:lang w:val="de-DE"/>
         </w:rPr>
         <w:t>__DATE__</w:t>
@@ -363,12 +394,13 @@
           <w:tab w:val="left" w:pos="4082"/>
         </w:tabs>
         <w:ind w:left="340" w:right="397"/>
+        <w:jc w:val="both"/>
         <w:rPr>
           <w:rFonts w:cstheme="majorHAnsi"/>
           <w:b/>
           <w:bCs/>
-          <w:sz w:val="24"/>
-          <w:szCs w:val="24"/>
+          <w:sz w:val="28"/>
+          <w:szCs w:val="28"/>
           <w:lang w:val="de-DE"/>
         </w:rPr>
       </w:pPr>
@@ -377,31 +409,47 @@
           <w:rFonts w:asciiTheme="majorHAnsi" w:hAnsiTheme="majorHAnsi" w:cstheme="majorHAnsi"/>
           <w:b/>
           <w:bCs/>
-          <w:sz w:val="24"/>
-          <w:szCs w:val="24"/>
-        </w:rPr>
-        <w:t>Bewerbung für die Stelle</w:t>
+          <w:sz w:val="28"/>
+          <w:szCs w:val="28"/>
+          <w:lang w:val="de-DE"/>
+        </w:rPr>
+        <w:t xml:space="preserve">Bewerbung </w:t>
       </w:r>
       <w:r>
         <w:rPr>
           <w:rFonts w:asciiTheme="majorHAnsi" w:hAnsiTheme="majorHAnsi" w:cstheme="majorHAnsi"/>
           <w:b/>
           <w:bCs/>
-          <w:sz w:val="24"/>
-          <w:szCs w:val="24"/>
-        </w:rPr>
-        <w:t xml:space="preserve">: </w:t>
+          <w:sz w:val="28"/>
+          <w:szCs w:val="28"/>
+          <w:lang w:val="de-DE"/>
+        </w:rPr>
+        <w:t>als</w:t>
       </w:r>
       <w:r>
         <w:rPr>
           <w:rFonts w:asciiTheme="majorHAnsi" w:hAnsiTheme="majorHAnsi" w:cstheme="majorHAnsi"/>
           <w:b/>
           <w:bCs/>
-          <w:sz w:val="24"/>
-          <w:szCs w:val="24"/>
+          <w:sz w:val="28"/>
+          <w:szCs w:val="28"/>
+          <w:lang w:val="de-DE"/>
+        </w:rPr>
+        <w:t xml:space="preserve"> </w:t>
+      </w:r>
+      <w:proofErr w:type="spellStart"/>
+      <w:r>
+        <w:rPr>
+          <w:rFonts w:asciiTheme="majorHAnsi" w:hAnsiTheme="majorHAnsi" w:cstheme="majorHAnsi"/>
+          <w:b/>
+          <w:bCs/>
+          <w:sz w:val="28"/>
+          <w:szCs w:val="28"/>
+          <w:lang w:val="de-DE"/>
         </w:rPr>
         <w:t>Position_name</w:t>
       </w:r>
+      <w:proofErr w:type="spellEnd"/>
     </w:p>
     <w:p>
       <w:pPr>
@@ -409,44 +457,53 @@
           <w:tab w:val="left" w:pos="4082"/>
         </w:tabs>
         <w:ind w:left="340" w:right="397"/>
+        <w:jc w:val="both"/>
         <w:rPr>
           <w:rFonts w:cstheme="majorHAnsi"/>
           <w:b/>
           <w:bCs/>
-          <w:sz w:val="24"/>
-          <w:szCs w:val="24"/>
-          <w:lang w:val="de-DE"/>
-        </w:rPr>
-      </w:pPr>
-      <w:r>
-        <w:rPr>
-          <w:rFonts w:asciiTheme="majorHAnsi" w:hAnsiTheme="majorHAnsi" w:cstheme="majorHAnsi"/>
-          <w:sz w:val="24"/>
-          <w:szCs w:val="24"/>
+          <w:sz w:val="28"/>
+          <w:szCs w:val="28"/>
+          <w:lang w:val="de-DE"/>
+        </w:rPr>
+      </w:pPr>
+      <w:proofErr w:type="spellStart"/>
+      <w:r>
+        <w:rPr>
+          <w:rFonts w:asciiTheme="majorHAnsi" w:hAnsiTheme="majorHAnsi" w:cstheme="majorHAnsi"/>
+          <w:sz w:val="28"/>
+          <w:szCs w:val="28"/>
+          <w:lang w:val="de-DE"/>
         </w:rPr>
         <w:t>Greeting</w:t>
       </w:r>
-      <w:r>
-        <w:rPr>
-          <w:rFonts w:asciiTheme="majorHAnsi" w:hAnsiTheme="majorHAnsi" w:cstheme="majorHAnsi"/>
-          <w:sz w:val="24"/>
-          <w:szCs w:val="24"/>
+      <w:proofErr w:type="spellEnd"/>
+      <w:r>
+        <w:rPr>
+          <w:rFonts w:asciiTheme="majorHAnsi" w:hAnsiTheme="majorHAnsi" w:cstheme="majorHAnsi"/>
+          <w:sz w:val="28"/>
+          <w:szCs w:val="28"/>
+          <w:lang w:val="de-DE"/>
         </w:rPr>
         <w:t xml:space="preserve"> </w:t>
       </w:r>
-      <w:r>
-        <w:rPr>
-          <w:rFonts w:asciiTheme="majorHAnsi" w:hAnsiTheme="majorHAnsi" w:cstheme="majorHAnsi"/>
-          <w:sz w:val="24"/>
-          <w:szCs w:val="24"/>
+      <w:proofErr w:type="spellStart"/>
+      <w:r>
+        <w:rPr>
+          <w:rFonts w:asciiTheme="majorHAnsi" w:hAnsiTheme="majorHAnsi" w:cstheme="majorHAnsi"/>
+          <w:sz w:val="28"/>
+          <w:szCs w:val="28"/>
+          <w:lang w:val="de-DE"/>
         </w:rPr>
         <w:t>Person_name</w:t>
       </w:r>
-      <w:r>
-        <w:rPr>
-          <w:rFonts w:asciiTheme="majorHAnsi" w:hAnsiTheme="majorHAnsi" w:cstheme="majorHAnsi"/>
-          <w:sz w:val="24"/>
-          <w:szCs w:val="24"/>
+      <w:proofErr w:type="spellEnd"/>
+      <w:r>
+        <w:rPr>
+          <w:rFonts w:asciiTheme="majorHAnsi" w:hAnsiTheme="majorHAnsi" w:cstheme="majorHAnsi"/>
+          <w:sz w:val="28"/>
+          <w:szCs w:val="28"/>
+          <w:lang w:val="de-DE"/>
         </w:rPr>
         <w:t>,</w:t>
       </w:r>
@@ -461,428 +518,108 @@
         <w:jc w:val="both"/>
         <w:rPr>
           <w:rFonts w:asciiTheme="majorHAnsi" w:hAnsiTheme="majorHAnsi" w:cstheme="majorHAnsi"/>
-          <w:sz w:val="24"/>
-          <w:szCs w:val="24"/>
-        </w:rPr>
-      </w:pPr>
-      <w:r>
-        <w:rPr>
-          <w:rFonts w:asciiTheme="majorHAnsi" w:hAnsiTheme="majorHAnsi" w:cstheme="majorHAnsi"/>
-          <w:sz w:val="24"/>
-          <w:szCs w:val="24"/>
-        </w:rPr>
-        <w:t xml:space="preserve">Hiermit möchte ich mein Interesse </w:t>
-      </w:r>
-      <w:r>
-        <w:rPr>
-          <w:rFonts w:asciiTheme="majorHAnsi" w:hAnsiTheme="majorHAnsi" w:cstheme="majorHAnsi"/>
-          <w:sz w:val="24"/>
-          <w:szCs w:val="24"/>
-        </w:rPr>
-        <w:t xml:space="preserve">an </w:t>
-      </w:r>
-      <w:r>
-        <w:rPr>
-          <w:rFonts w:asciiTheme="majorHAnsi" w:hAnsiTheme="majorHAnsi" w:cstheme="majorHAnsi"/>
-          <w:sz w:val="24"/>
-          <w:szCs w:val="24"/>
-        </w:rPr>
-        <w:t xml:space="preserve">der oben genannten Stelle in </w:t>
-      </w:r>
-      <w:r>
-        <w:rPr>
-          <w:rFonts w:asciiTheme="majorHAnsi" w:hAnsiTheme="majorHAnsi" w:cstheme="majorHAnsi"/>
-          <w:sz w:val="24"/>
-          <w:szCs w:val="24"/>
+          <w:sz w:val="28"/>
+          <w:szCs w:val="28"/>
+          <w:lang w:val="de-DE"/>
+        </w:rPr>
+      </w:pPr>
+      <w:r>
+        <w:rPr>
+          <w:rFonts w:asciiTheme="majorHAnsi" w:hAnsiTheme="majorHAnsi" w:cstheme="majorHAnsi"/>
+          <w:sz w:val="28"/>
+          <w:szCs w:val="28"/>
+          <w:lang w:val="de-DE"/>
+        </w:rPr>
+        <w:t xml:space="preserve">mit großem Interesse bewerbe ich mich als </w:t>
+      </w:r>
+      <w:proofErr w:type="spellStart"/>
+      <w:r>
+        <w:rPr>
+          <w:rFonts w:asciiTheme="majorHAnsi" w:hAnsiTheme="majorHAnsi" w:cstheme="majorHAnsi"/>
+          <w:sz w:val="28"/>
+          <w:szCs w:val="28"/>
+          <w:lang w:val="de-DE"/>
+        </w:rPr>
+        <w:t>Position_name</w:t>
+      </w:r>
+      <w:proofErr w:type="spellEnd"/>
+      <w:r>
+        <w:rPr>
+          <w:rFonts w:asciiTheme="majorHAnsi" w:hAnsiTheme="majorHAnsi" w:cstheme="majorHAnsi"/>
+          <w:sz w:val="28"/>
+          <w:szCs w:val="28"/>
+          <w:lang w:val="de-DE"/>
+        </w:rPr>
+        <w:t xml:space="preserve"> </w:t>
+      </w:r>
+      <w:r>
+        <w:rPr>
+          <w:rFonts w:asciiTheme="majorHAnsi" w:hAnsiTheme="majorHAnsi" w:cstheme="majorHAnsi"/>
+          <w:sz w:val="28"/>
+          <w:szCs w:val="28"/>
+          <w:lang w:val="de-DE"/>
+        </w:rPr>
+        <w:t xml:space="preserve">bei </w:t>
+      </w:r>
+      <w:proofErr w:type="spellStart"/>
+      <w:r>
+        <w:rPr>
+          <w:rFonts w:asciiTheme="majorHAnsi" w:hAnsiTheme="majorHAnsi" w:cstheme="majorHAnsi"/>
+          <w:sz w:val="28"/>
+          <w:szCs w:val="28"/>
+          <w:lang w:val="de-DE"/>
         </w:rPr>
         <w:t>Company_name</w:t>
       </w:r>
-      <w:r>
-        <w:rPr>
-          <w:rFonts w:asciiTheme="majorHAnsi" w:hAnsiTheme="majorHAnsi" w:cstheme="majorHAnsi"/>
-          <w:sz w:val="24"/>
-          <w:szCs w:val="24"/>
-        </w:rPr>
-        <w:t xml:space="preserve"> </w:t>
-      </w:r>
-      <w:r>
-        <w:rPr>
-          <w:rFonts w:asciiTheme="majorHAnsi" w:hAnsiTheme="majorHAnsi" w:cstheme="majorHAnsi"/>
-          <w:sz w:val="24"/>
-          <w:szCs w:val="24"/>
-        </w:rPr>
-        <w:t>bekunden.</w:t>
-      </w:r>
-      <w:r>
-        <w:rPr>
-          <w:rFonts w:asciiTheme="majorHAnsi" w:hAnsiTheme="majorHAnsi" w:cstheme="majorHAnsi"/>
-          <w:sz w:val="24"/>
-          <w:szCs w:val="24"/>
-        </w:rPr>
-        <w:t xml:space="preserve"> </w:t>
-      </w:r>
-      <w:r>
-        <w:rPr>
-          <w:rFonts w:asciiTheme="majorHAnsi" w:hAnsiTheme="majorHAnsi" w:cstheme="majorHAnsi"/>
-          <w:sz w:val="24"/>
-          <w:szCs w:val="24"/>
-        </w:rPr>
-        <w:t xml:space="preserve">Ich </w:t>
-      </w:r>
-      <w:r>
-        <w:rPr>
-          <w:rFonts w:asciiTheme="majorHAnsi" w:hAnsiTheme="majorHAnsi" w:cstheme="majorHAnsi"/>
-          <w:sz w:val="24"/>
-          <w:szCs w:val="24"/>
-        </w:rPr>
-        <w:t>habe fast 2 Jahren</w:t>
-      </w:r>
-      <w:r>
-        <w:rPr>
-          <w:rFonts w:asciiTheme="majorHAnsi" w:hAnsiTheme="majorHAnsi" w:cstheme="majorHAnsi"/>
-          <w:sz w:val="24"/>
-          <w:szCs w:val="24"/>
-        </w:rPr>
-        <w:t xml:space="preserve"> </w:t>
-      </w:r>
-      <w:r>
-        <w:rPr>
-          <w:rFonts w:asciiTheme="majorHAnsi" w:hAnsiTheme="majorHAnsi" w:cstheme="majorHAnsi"/>
-          <w:sz w:val="24"/>
-          <w:szCs w:val="24"/>
-        </w:rPr>
-        <w:t xml:space="preserve">Erfahrungen </w:t>
-      </w:r>
-      <w:r>
-        <w:rPr>
-          <w:rFonts w:asciiTheme="majorHAnsi" w:hAnsiTheme="majorHAnsi" w:cstheme="majorHAnsi"/>
-          <w:sz w:val="24"/>
-          <w:szCs w:val="24"/>
-        </w:rPr>
-        <w:t>als Performance Ingenieur</w:t>
-      </w:r>
-      <w:r>
-        <w:rPr>
-          <w:rFonts w:asciiTheme="majorHAnsi" w:hAnsiTheme="majorHAnsi" w:cstheme="majorHAnsi"/>
-          <w:sz w:val="24"/>
-          <w:szCs w:val="24"/>
-        </w:rPr>
-        <w:t xml:space="preserve"> und</w:t>
-      </w:r>
-      <w:r>
-        <w:rPr>
-          <w:rFonts w:asciiTheme="majorHAnsi" w:hAnsiTheme="majorHAnsi" w:cstheme="majorHAnsi"/>
-          <w:sz w:val="24"/>
-          <w:szCs w:val="24"/>
-        </w:rPr>
-        <w:t xml:space="preserve"> </w:t>
-      </w:r>
-      <w:r>
-        <w:rPr>
-          <w:rFonts w:asciiTheme="majorHAnsi" w:hAnsiTheme="majorHAnsi" w:cstheme="majorHAnsi"/>
-          <w:sz w:val="24"/>
-          <w:szCs w:val="24"/>
-        </w:rPr>
-        <w:t xml:space="preserve">5 Jahren </w:t>
-      </w:r>
-      <w:r>
-        <w:rPr>
-          <w:rFonts w:asciiTheme="majorHAnsi" w:hAnsiTheme="majorHAnsi" w:cstheme="majorHAnsi"/>
-          <w:sz w:val="24"/>
-          <w:szCs w:val="24"/>
-        </w:rPr>
-        <w:t xml:space="preserve">Erfahrungen </w:t>
-      </w:r>
-      <w:r>
-        <w:rPr>
-          <w:rFonts w:asciiTheme="majorHAnsi" w:hAnsiTheme="majorHAnsi" w:cstheme="majorHAnsi"/>
-          <w:sz w:val="24"/>
-          <w:szCs w:val="24"/>
-        </w:rPr>
-        <w:t xml:space="preserve">als </w:t>
-      </w:r>
-      <w:r>
-        <w:rPr>
-          <w:rFonts w:asciiTheme="majorHAnsi" w:hAnsiTheme="majorHAnsi" w:cstheme="majorHAnsi"/>
-          <w:sz w:val="24"/>
-          <w:szCs w:val="24"/>
-        </w:rPr>
-        <w:t>System</w:t>
-      </w:r>
-      <w:r>
-        <w:rPr>
-          <w:rFonts w:asciiTheme="majorHAnsi" w:hAnsiTheme="majorHAnsi" w:cstheme="majorHAnsi"/>
-          <w:sz w:val="24"/>
-          <w:szCs w:val="24"/>
-        </w:rPr>
-        <w:t xml:space="preserve"> </w:t>
-      </w:r>
-      <w:r>
-        <w:rPr>
-          <w:rFonts w:asciiTheme="majorHAnsi" w:hAnsiTheme="majorHAnsi" w:cstheme="majorHAnsi"/>
-          <w:sz w:val="24"/>
-          <w:szCs w:val="24"/>
-        </w:rPr>
-        <w:t>Engineer</w:t>
-      </w:r>
-      <w:r>
-        <w:rPr>
-          <w:rFonts w:asciiTheme="majorHAnsi" w:hAnsiTheme="majorHAnsi" w:cstheme="majorHAnsi"/>
-          <w:sz w:val="24"/>
-          <w:szCs w:val="24"/>
-        </w:rPr>
-        <w:t xml:space="preserve">. Ich habe sehr gute </w:t>
-      </w:r>
-      <w:r>
-        <w:rPr>
-          <w:rFonts w:asciiTheme="majorHAnsi" w:hAnsiTheme="majorHAnsi" w:cstheme="majorHAnsi"/>
-          <w:sz w:val="24"/>
-          <w:szCs w:val="24"/>
-        </w:rPr>
-        <w:t>Erfahrungen</w:t>
-      </w:r>
-      <w:r>
-        <w:rPr>
-          <w:rFonts w:asciiTheme="majorHAnsi" w:hAnsiTheme="majorHAnsi" w:cstheme="majorHAnsi"/>
-          <w:sz w:val="24"/>
-          <w:szCs w:val="24"/>
-        </w:rPr>
-        <w:t xml:space="preserve"> </w:t>
-      </w:r>
-      <w:r>
-        <w:rPr>
-          <w:rFonts w:asciiTheme="majorHAnsi" w:hAnsiTheme="majorHAnsi" w:cstheme="majorHAnsi"/>
-          <w:sz w:val="24"/>
-          <w:szCs w:val="24"/>
-        </w:rPr>
-        <w:t xml:space="preserve">in C, C++, </w:t>
-      </w:r>
-      <w:r>
-        <w:rPr>
-          <w:rFonts w:asciiTheme="majorHAnsi" w:hAnsiTheme="majorHAnsi" w:cstheme="majorHAnsi"/>
-          <w:sz w:val="24"/>
-          <w:szCs w:val="24"/>
-        </w:rPr>
-        <w:t xml:space="preserve">CI/CD, Azure, AWS, </w:t>
-      </w:r>
-      <w:r>
-        <w:rPr>
-          <w:rFonts w:asciiTheme="majorHAnsi" w:hAnsiTheme="majorHAnsi" w:cstheme="majorHAnsi"/>
-          <w:sz w:val="24"/>
-          <w:szCs w:val="24"/>
-        </w:rPr>
-        <w:t>Python, Matlab,</w:t>
-      </w:r>
-      <w:r>
-        <w:rPr>
-          <w:rFonts w:asciiTheme="majorHAnsi" w:hAnsiTheme="majorHAnsi" w:cstheme="majorHAnsi"/>
-          <w:sz w:val="24"/>
-          <w:szCs w:val="24"/>
-        </w:rPr>
-        <w:t xml:space="preserve"> </w:t>
-      </w:r>
-      <w:r>
-        <w:rPr>
-          <w:rFonts w:asciiTheme="majorHAnsi" w:hAnsiTheme="majorHAnsi" w:cstheme="majorHAnsi"/>
-          <w:sz w:val="24"/>
-          <w:szCs w:val="24"/>
-        </w:rPr>
-        <w:t>Pos</w:t>
-      </w:r>
-      <w:r>
-        <w:rPr>
-          <w:rFonts w:asciiTheme="majorHAnsi" w:hAnsiTheme="majorHAnsi" w:cstheme="majorHAnsi"/>
-          <w:sz w:val="24"/>
-          <w:szCs w:val="24"/>
-        </w:rPr>
-        <w:t>t</w:t>
-      </w:r>
-      <w:r>
-        <w:rPr>
-          <w:rFonts w:asciiTheme="majorHAnsi" w:hAnsiTheme="majorHAnsi" w:cstheme="majorHAnsi"/>
-          <w:sz w:val="24"/>
-          <w:szCs w:val="24"/>
-        </w:rPr>
-        <w:t>greSQL, DB2,</w:t>
-      </w:r>
-      <w:r>
-        <w:rPr>
-          <w:rFonts w:asciiTheme="majorHAnsi" w:hAnsiTheme="majorHAnsi" w:cstheme="majorHAnsi"/>
-          <w:sz w:val="24"/>
-          <w:szCs w:val="24"/>
-        </w:rPr>
-        <w:t xml:space="preserve"> </w:t>
-      </w:r>
-      <w:r>
-        <w:rPr>
-          <w:rFonts w:asciiTheme="majorHAnsi" w:hAnsiTheme="majorHAnsi" w:cstheme="majorHAnsi"/>
-          <w:sz w:val="24"/>
-          <w:szCs w:val="24"/>
-        </w:rPr>
-        <w:t xml:space="preserve">OpenSSH, </w:t>
-      </w:r>
-      <w:r>
-        <w:rPr>
-          <w:rFonts w:asciiTheme="majorHAnsi" w:hAnsiTheme="majorHAnsi" w:cstheme="majorHAnsi"/>
-          <w:sz w:val="24"/>
-          <w:szCs w:val="24"/>
-        </w:rPr>
-        <w:t xml:space="preserve">Cmdlets, CLI, </w:t>
-      </w:r>
-      <w:r>
-        <w:rPr>
-          <w:rFonts w:asciiTheme="majorHAnsi" w:hAnsiTheme="majorHAnsi" w:cstheme="majorHAnsi"/>
-          <w:sz w:val="24"/>
-          <w:szCs w:val="24"/>
-        </w:rPr>
-        <w:t>Power BI,</w:t>
-      </w:r>
-      <w:r>
-        <w:rPr>
-          <w:rFonts w:asciiTheme="majorHAnsi" w:hAnsiTheme="majorHAnsi" w:cstheme="majorHAnsi"/>
-          <w:sz w:val="24"/>
-          <w:szCs w:val="24"/>
-        </w:rPr>
-        <w:t xml:space="preserve"> </w:t>
-      </w:r>
-      <w:r>
-        <w:rPr>
-          <w:rFonts w:asciiTheme="majorHAnsi" w:hAnsiTheme="majorHAnsi" w:cstheme="majorHAnsi"/>
-          <w:sz w:val="24"/>
-          <w:szCs w:val="24"/>
-        </w:rPr>
-        <w:t xml:space="preserve">Git, </w:t>
-      </w:r>
-      <w:hyperlink r:id="rId8" w:history="1">
-        <w:r>
-          <w:rPr>
-            <w:rStyle w:val="Hyperlink"/>
-            <w:rFonts w:asciiTheme="majorHAnsi" w:hAnsiTheme="majorHAnsi" w:cstheme="majorHAnsi"/>
-            <w:sz w:val="24"/>
-            <w:szCs w:val="24"/>
-          </w:rPr>
-          <w:t>GitHub</w:t>
-        </w:r>
-      </w:hyperlink>
-      <w:r>
-        <w:rPr>
-          <w:rFonts w:asciiTheme="majorHAnsi" w:hAnsiTheme="majorHAnsi" w:cstheme="majorHAnsi"/>
-          <w:sz w:val="24"/>
-          <w:szCs w:val="24"/>
-        </w:rPr>
-        <w:t xml:space="preserve">, </w:t>
-      </w:r>
-      <w:r>
-        <w:rPr>
-          <w:rFonts w:asciiTheme="majorHAnsi" w:hAnsiTheme="majorHAnsi" w:cstheme="majorHAnsi"/>
-          <w:sz w:val="24"/>
-          <w:szCs w:val="24"/>
-        </w:rPr>
-        <w:t xml:space="preserve">GitLab, </w:t>
-      </w:r>
-      <w:r>
-        <w:rPr>
-          <w:rFonts w:asciiTheme="majorHAnsi" w:hAnsiTheme="majorHAnsi" w:cstheme="majorHAnsi"/>
-          <w:sz w:val="24"/>
-          <w:szCs w:val="24"/>
-        </w:rPr>
-        <w:t xml:space="preserve">Bicep, JSON, YAML, IaC, </w:t>
-      </w:r>
-      <w:r>
-        <w:rPr>
-          <w:rFonts w:asciiTheme="majorHAnsi" w:hAnsiTheme="majorHAnsi" w:cstheme="majorHAnsi"/>
-          <w:sz w:val="24"/>
-          <w:szCs w:val="24"/>
-        </w:rPr>
-        <w:t xml:space="preserve">Docker, </w:t>
-      </w:r>
-      <w:r>
-        <w:rPr>
-          <w:rFonts w:asciiTheme="majorHAnsi" w:hAnsiTheme="majorHAnsi" w:cstheme="majorHAnsi"/>
-          <w:sz w:val="24"/>
-          <w:szCs w:val="24"/>
-        </w:rPr>
-        <w:t xml:space="preserve">JMeter, </w:t>
-      </w:r>
-      <w:r>
-        <w:rPr>
-          <w:rFonts w:asciiTheme="majorHAnsi" w:hAnsiTheme="majorHAnsi" w:cstheme="majorHAnsi"/>
-          <w:sz w:val="24"/>
-          <w:szCs w:val="24"/>
-        </w:rPr>
-        <w:t xml:space="preserve">RESTful </w:t>
-      </w:r>
-      <w:r>
-        <w:rPr>
-          <w:rFonts w:asciiTheme="majorHAnsi" w:hAnsiTheme="majorHAnsi" w:cstheme="majorHAnsi"/>
-          <w:sz w:val="24"/>
-          <w:szCs w:val="24"/>
-        </w:rPr>
-        <w:t>API,</w:t>
-      </w:r>
-      <w:r>
-        <w:rPr>
-          <w:rFonts w:asciiTheme="majorHAnsi" w:hAnsiTheme="majorHAnsi" w:cstheme="majorHAnsi"/>
-          <w:sz w:val="24"/>
-          <w:szCs w:val="24"/>
-        </w:rPr>
-        <w:t xml:space="preserve"> Kubernetes,</w:t>
-      </w:r>
-      <w:r>
-        <w:rPr>
-          <w:rFonts w:asciiTheme="majorHAnsi" w:hAnsiTheme="majorHAnsi" w:cstheme="majorHAnsi"/>
-          <w:sz w:val="24"/>
-          <w:szCs w:val="24"/>
-        </w:rPr>
-        <w:t xml:space="preserve"> Kafka,</w:t>
-      </w:r>
-      <w:r>
-        <w:rPr>
-          <w:rFonts w:asciiTheme="majorHAnsi" w:hAnsiTheme="majorHAnsi" w:cstheme="majorHAnsi"/>
-          <w:sz w:val="24"/>
-          <w:szCs w:val="24"/>
-        </w:rPr>
-        <w:t xml:space="preserve"> </w:t>
-      </w:r>
-      <w:r>
-        <w:rPr>
-          <w:rFonts w:asciiTheme="majorHAnsi" w:hAnsiTheme="majorHAnsi" w:cstheme="majorHAnsi"/>
-          <w:sz w:val="24"/>
-          <w:szCs w:val="24"/>
-        </w:rPr>
-        <w:t xml:space="preserve">JavaScript, </w:t>
-      </w:r>
-      <w:r>
-        <w:rPr>
-          <w:rFonts w:asciiTheme="majorHAnsi" w:hAnsiTheme="majorHAnsi" w:cstheme="majorHAnsi"/>
-          <w:sz w:val="24"/>
-          <w:szCs w:val="24"/>
-        </w:rPr>
-        <w:t>Grafana, Kibana</w:t>
-      </w:r>
-      <w:r>
-        <w:rPr>
-          <w:rFonts w:asciiTheme="majorHAnsi" w:hAnsiTheme="majorHAnsi" w:cstheme="majorHAnsi"/>
-          <w:sz w:val="24"/>
-          <w:szCs w:val="24"/>
-        </w:rPr>
-        <w:t>, Ansible, Terraform</w:t>
-      </w:r>
-      <w:r>
-        <w:rPr>
-          <w:rFonts w:asciiTheme="majorHAnsi" w:hAnsiTheme="majorHAnsi" w:cstheme="majorHAnsi"/>
-          <w:sz w:val="24"/>
-          <w:szCs w:val="24"/>
-        </w:rPr>
-        <w:t>.</w:t>
-      </w:r>
-      <w:r>
-        <w:rPr>
-          <w:rFonts w:asciiTheme="majorHAnsi" w:hAnsiTheme="majorHAnsi" w:cstheme="majorHAnsi"/>
-          <w:sz w:val="24"/>
-          <w:szCs w:val="24"/>
-        </w:rPr>
-        <w:t xml:space="preserve"> </w:t>
+      <w:proofErr w:type="spellEnd"/>
+      <w:r>
+        <w:rPr>
+          <w:rFonts w:asciiTheme="majorHAnsi" w:hAnsiTheme="majorHAnsi" w:cstheme="majorHAnsi"/>
+          <w:sz w:val="28"/>
+          <w:szCs w:val="28"/>
+          <w:lang w:val="de-DE"/>
+        </w:rPr>
+        <w:t xml:space="preserve">. Durch meine mehrjährige Erfahrung als System Engineer und Performance Engineer sowie meine aktuellen Weiterbildungen im Bereich Cloud &amp; </w:t>
+      </w:r>
+      <w:proofErr w:type="spellStart"/>
+      <w:r>
+        <w:rPr>
+          <w:rFonts w:asciiTheme="majorHAnsi" w:hAnsiTheme="majorHAnsi" w:cstheme="majorHAnsi"/>
+          <w:sz w:val="28"/>
+          <w:szCs w:val="28"/>
+          <w:lang w:val="de-DE"/>
+        </w:rPr>
+        <w:t>DevOps</w:t>
+      </w:r>
+      <w:proofErr w:type="spellEnd"/>
+      <w:r>
+        <w:rPr>
+          <w:rFonts w:asciiTheme="majorHAnsi" w:hAnsiTheme="majorHAnsi" w:cstheme="majorHAnsi"/>
+          <w:sz w:val="28"/>
+          <w:szCs w:val="28"/>
+          <w:lang w:val="de-DE"/>
+        </w:rPr>
+        <w:t xml:space="preserve"> bringe ich ein starkes Profil für moderne </w:t>
+      </w:r>
+      <w:proofErr w:type="spellStart"/>
+      <w:r>
+        <w:rPr>
+          <w:rFonts w:asciiTheme="majorHAnsi" w:hAnsiTheme="majorHAnsi" w:cstheme="majorHAnsi"/>
+          <w:sz w:val="28"/>
+          <w:szCs w:val="28"/>
+          <w:lang w:val="de-DE"/>
+        </w:rPr>
+        <w:t>DevOps</w:t>
+      </w:r>
+      <w:proofErr w:type="spellEnd"/>
+      <w:r>
+        <w:rPr>
+          <w:rFonts w:asciiTheme="majorHAnsi" w:hAnsiTheme="majorHAnsi" w:cstheme="majorHAnsi"/>
+          <w:sz w:val="28"/>
+          <w:szCs w:val="28"/>
+          <w:lang w:val="de-DE"/>
+        </w:rPr>
+        <w:t>-Umgebungen mit.</w:t>
       </w:r>
     </w:p>
     <w:p>
@@ -895,62 +632,79 @@
         <w:jc w:val="both"/>
         <w:rPr>
           <w:rFonts w:asciiTheme="majorHAnsi" w:hAnsiTheme="majorHAnsi" w:cstheme="majorHAnsi"/>
-          <w:sz w:val="24"/>
-          <w:szCs w:val="24"/>
-        </w:rPr>
-      </w:pPr>
-      <w:r>
-        <w:rPr>
-          <w:rFonts w:asciiTheme="majorHAnsi" w:hAnsiTheme="majorHAnsi" w:cstheme="majorHAnsi"/>
-          <w:sz w:val="24"/>
-          <w:szCs w:val="24"/>
-        </w:rPr>
-        <w:t>Ich verfolge mit hoher Motivation das Ziel, meine berufliche Laufbahn im DevOps</w:t>
-      </w:r>
-      <w:r>
-        <w:rPr>
-          <w:rFonts w:asciiTheme="majorHAnsi" w:hAnsiTheme="majorHAnsi" w:cstheme="majorHAnsi"/>
-          <w:sz w:val="24"/>
-          <w:szCs w:val="24"/>
-        </w:rPr>
-        <w:noBreakHyphen/>
-        <w:t xml:space="preserve">Bereich auszubauen. Die Zertifizierungen </w:t>
-      </w:r>
-      <w:r>
-        <w:rPr>
-          <w:rFonts w:asciiTheme="majorHAnsi" w:hAnsiTheme="majorHAnsi" w:cstheme="majorHAnsi"/>
-          <w:b/>
-          <w:bCs/>
-          <w:sz w:val="24"/>
-          <w:szCs w:val="24"/>
-        </w:rPr>
-        <w:t>DevOps Engineer Expert</w:t>
-      </w:r>
-      <w:r>
-        <w:rPr>
-          <w:rFonts w:asciiTheme="majorHAnsi" w:hAnsiTheme="majorHAnsi" w:cstheme="majorHAnsi"/>
-          <w:sz w:val="24"/>
-          <w:szCs w:val="24"/>
-        </w:rPr>
-        <w:t xml:space="preserve"> und </w:t>
-      </w:r>
-      <w:r>
-        <w:rPr>
-          <w:rFonts w:asciiTheme="majorHAnsi" w:hAnsiTheme="majorHAnsi" w:cstheme="majorHAnsi"/>
-          <w:b/>
-          <w:bCs/>
-          <w:sz w:val="24"/>
-          <w:szCs w:val="24"/>
-        </w:rPr>
-        <w:t>Azure Administrator Associate</w:t>
-      </w:r>
-      <w:r>
-        <w:rPr>
-          <w:rFonts w:asciiTheme="majorHAnsi" w:hAnsiTheme="majorHAnsi" w:cstheme="majorHAnsi"/>
-          <w:sz w:val="24"/>
-          <w:szCs w:val="24"/>
-        </w:rPr>
-        <w:t xml:space="preserve"> bestätigen meine fundierten Kenntnisse und mein Engagement.</w:t>
+          <w:sz w:val="28"/>
+          <w:szCs w:val="28"/>
+          <w:lang w:val="de-DE"/>
+        </w:rPr>
+      </w:pPr>
+      <w:r>
+        <w:rPr>
+          <w:rFonts w:asciiTheme="majorHAnsi" w:hAnsiTheme="majorHAnsi" w:cstheme="majorHAnsi"/>
+          <w:sz w:val="28"/>
+          <w:szCs w:val="28"/>
+          <w:lang w:val="de-DE"/>
+        </w:rPr>
+        <w:t xml:space="preserve">Bei Ferchau GmbH arbeitete ich intensiv mit </w:t>
+      </w:r>
+      <w:proofErr w:type="spellStart"/>
+      <w:r>
+        <w:rPr>
+          <w:rFonts w:asciiTheme="majorHAnsi" w:hAnsiTheme="majorHAnsi" w:cstheme="majorHAnsi"/>
+          <w:sz w:val="28"/>
+          <w:szCs w:val="28"/>
+          <w:lang w:val="de-DE"/>
+        </w:rPr>
+        <w:t>GitLab</w:t>
+      </w:r>
+      <w:proofErr w:type="spellEnd"/>
+      <w:r>
+        <w:rPr>
+          <w:rFonts w:asciiTheme="majorHAnsi" w:hAnsiTheme="majorHAnsi" w:cstheme="majorHAnsi"/>
+          <w:sz w:val="28"/>
+          <w:szCs w:val="28"/>
+          <w:lang w:val="de-DE"/>
+        </w:rPr>
+        <w:t xml:space="preserve"> CI, Docker, PowerShell, REST APIs, PostgreSQL, Linux sowie Monitoring-Tools wie </w:t>
+      </w:r>
+      <w:proofErr w:type="spellStart"/>
+      <w:r>
+        <w:rPr>
+          <w:rFonts w:asciiTheme="majorHAnsi" w:hAnsiTheme="majorHAnsi" w:cstheme="majorHAnsi"/>
+          <w:sz w:val="28"/>
+          <w:szCs w:val="28"/>
+          <w:lang w:val="de-DE"/>
+        </w:rPr>
+        <w:t>Grafana</w:t>
+      </w:r>
+      <w:proofErr w:type="spellEnd"/>
+      <w:r>
+        <w:rPr>
+          <w:rFonts w:asciiTheme="majorHAnsi" w:hAnsiTheme="majorHAnsi" w:cstheme="majorHAnsi"/>
+          <w:sz w:val="28"/>
+          <w:szCs w:val="28"/>
+          <w:lang w:val="de-DE"/>
+        </w:rPr>
+        <w:t xml:space="preserve">. Zu meinen Aufgaben gehörten die Automatisierung von Analyse- und Troubleshooting-Prozessen, die Bereitstellung neuer Softwareversionen auf Produktionssystemen, die Auswertung von Logs und Metriken sowie die Performance-Optimierung. Diese Tätigkeiten haben meine Fähigkeiten in automatisierten, </w:t>
+      </w:r>
+      <w:proofErr w:type="spellStart"/>
+      <w:r>
+        <w:rPr>
+          <w:rFonts w:asciiTheme="majorHAnsi" w:hAnsiTheme="majorHAnsi" w:cstheme="majorHAnsi"/>
+          <w:sz w:val="28"/>
+          <w:szCs w:val="28"/>
+          <w:lang w:val="de-DE"/>
+        </w:rPr>
+        <w:t>cloud</w:t>
+      </w:r>
+      <w:proofErr w:type="spellEnd"/>
+      <w:r>
+        <w:rPr>
+          <w:rFonts w:asciiTheme="majorHAnsi" w:hAnsiTheme="majorHAnsi" w:cstheme="majorHAnsi"/>
+          <w:sz w:val="28"/>
+          <w:szCs w:val="28"/>
+          <w:lang w:val="de-DE"/>
+        </w:rPr>
+        <w:t>-orientierten Umgebungen deutlich gestärkt.</w:t>
       </w:r>
     </w:p>
     <w:p>
@@ -963,33 +717,274 @@
         <w:jc w:val="both"/>
         <w:rPr>
           <w:rFonts w:asciiTheme="majorHAnsi" w:hAnsiTheme="majorHAnsi" w:cstheme="majorHAnsi"/>
-          <w:sz w:val="24"/>
-          <w:szCs w:val="24"/>
-        </w:rPr>
-      </w:pPr>
-      <w:r>
-        <w:rPr>
-          <w:rFonts w:asciiTheme="majorHAnsi" w:hAnsiTheme="majorHAnsi" w:cstheme="majorHAnsi"/>
-          <w:sz w:val="24"/>
-          <w:szCs w:val="24"/>
-        </w:rPr>
-        <w:t>Aufgrund meiner beruflichen Erfahrung und meines fundierten Fachwissens betrachte ich mich als hervorragend geeigneten Kandidaten für die ausgeschriebene Position</w:t>
-      </w:r>
-      <w:r>
-        <w:rPr>
-          <w:rFonts w:asciiTheme="majorHAnsi" w:hAnsiTheme="majorHAnsi" w:cstheme="majorHAnsi"/>
-          <w:sz w:val="24"/>
-          <w:szCs w:val="24"/>
+          <w:sz w:val="28"/>
+          <w:szCs w:val="28"/>
+          <w:lang w:val="de-DE"/>
+        </w:rPr>
+      </w:pPr>
+      <w:r>
+        <w:rPr>
+          <w:rFonts w:asciiTheme="majorHAnsi" w:hAnsiTheme="majorHAnsi" w:cstheme="majorHAnsi"/>
+          <w:sz w:val="28"/>
+          <w:szCs w:val="28"/>
+          <w:lang w:val="de-DE"/>
+        </w:rPr>
+        <w:t xml:space="preserve">Während meiner fünfjährigen Tätigkeit bei </w:t>
+      </w:r>
+      <w:proofErr w:type="spellStart"/>
+      <w:r>
+        <w:rPr>
+          <w:rFonts w:asciiTheme="majorHAnsi" w:hAnsiTheme="majorHAnsi" w:cstheme="majorHAnsi"/>
+          <w:sz w:val="28"/>
+          <w:szCs w:val="28"/>
+          <w:lang w:val="de-DE"/>
+        </w:rPr>
+        <w:t>Tata</w:t>
+      </w:r>
+      <w:proofErr w:type="spellEnd"/>
+      <w:r>
+        <w:rPr>
+          <w:rFonts w:asciiTheme="majorHAnsi" w:hAnsiTheme="majorHAnsi" w:cstheme="majorHAnsi"/>
+          <w:sz w:val="28"/>
+          <w:szCs w:val="28"/>
+          <w:lang w:val="de-DE"/>
         </w:rPr>
         <w:t xml:space="preserve"> </w:t>
       </w:r>
-      <w:r>
-        <w:rPr>
-          <w:rFonts w:asciiTheme="majorHAnsi" w:hAnsiTheme="majorHAnsi" w:cstheme="majorHAnsi"/>
-          <w:sz w:val="24"/>
-          <w:szCs w:val="24"/>
-        </w:rPr>
-        <w:t>in Ihrem Unternehmen.</w:t>
+      <w:proofErr w:type="spellStart"/>
+      <w:r>
+        <w:rPr>
+          <w:rFonts w:asciiTheme="majorHAnsi" w:hAnsiTheme="majorHAnsi" w:cstheme="majorHAnsi"/>
+          <w:sz w:val="28"/>
+          <w:szCs w:val="28"/>
+          <w:lang w:val="de-DE"/>
+        </w:rPr>
+        <w:t>Consultancy</w:t>
+      </w:r>
+      <w:proofErr w:type="spellEnd"/>
+      <w:r>
+        <w:rPr>
+          <w:rFonts w:asciiTheme="majorHAnsi" w:hAnsiTheme="majorHAnsi" w:cstheme="majorHAnsi"/>
+          <w:sz w:val="28"/>
+          <w:szCs w:val="28"/>
+          <w:lang w:val="de-DE"/>
+        </w:rPr>
+        <w:t xml:space="preserve"> Services war ich für CI/CD-Pipelines, Release- und </w:t>
+      </w:r>
+      <w:proofErr w:type="spellStart"/>
+      <w:r>
+        <w:rPr>
+          <w:rFonts w:asciiTheme="majorHAnsi" w:hAnsiTheme="majorHAnsi" w:cstheme="majorHAnsi"/>
+          <w:sz w:val="28"/>
+          <w:szCs w:val="28"/>
+          <w:lang w:val="de-DE"/>
+        </w:rPr>
+        <w:t>Incident</w:t>
+      </w:r>
+      <w:proofErr w:type="spellEnd"/>
+      <w:r>
+        <w:rPr>
+          <w:rFonts w:asciiTheme="majorHAnsi" w:hAnsiTheme="majorHAnsi" w:cstheme="majorHAnsi"/>
+          <w:sz w:val="28"/>
+          <w:szCs w:val="28"/>
+          <w:lang w:val="de-DE"/>
+        </w:rPr>
+        <w:t xml:space="preserve">-Management, Skript-Automatisierung sowie Tools wie Jenkins, GitHub, </w:t>
+      </w:r>
+      <w:proofErr w:type="spellStart"/>
+      <w:r>
+        <w:rPr>
+          <w:rFonts w:asciiTheme="majorHAnsi" w:hAnsiTheme="majorHAnsi" w:cstheme="majorHAnsi"/>
+          <w:sz w:val="28"/>
+          <w:szCs w:val="28"/>
+          <w:lang w:val="de-DE"/>
+        </w:rPr>
+        <w:t>Dynatrace</w:t>
+      </w:r>
+      <w:proofErr w:type="spellEnd"/>
+      <w:r>
+        <w:rPr>
+          <w:rFonts w:asciiTheme="majorHAnsi" w:hAnsiTheme="majorHAnsi" w:cstheme="majorHAnsi"/>
+          <w:sz w:val="28"/>
+          <w:szCs w:val="28"/>
+          <w:lang w:val="de-DE"/>
+        </w:rPr>
+        <w:t xml:space="preserve">, Splunk und DB2 verantwortlich. Dadurch verfüge ich über ein solides Verständnis von </w:t>
+      </w:r>
+      <w:proofErr w:type="spellStart"/>
+      <w:r>
+        <w:rPr>
+          <w:rFonts w:asciiTheme="majorHAnsi" w:hAnsiTheme="majorHAnsi" w:cstheme="majorHAnsi"/>
+          <w:sz w:val="28"/>
+          <w:szCs w:val="28"/>
+          <w:lang w:val="de-DE"/>
+        </w:rPr>
+        <w:t>DevOps</w:t>
+      </w:r>
+      <w:proofErr w:type="spellEnd"/>
+      <w:r>
+        <w:rPr>
+          <w:rFonts w:asciiTheme="majorHAnsi" w:hAnsiTheme="majorHAnsi" w:cstheme="majorHAnsi"/>
+          <w:sz w:val="28"/>
+          <w:szCs w:val="28"/>
+          <w:lang w:val="de-DE"/>
+        </w:rPr>
+        <w:t>-Prinzipien, Produktionsbetrieb und teamübergreifender Zusammenarbeit.</w:t>
+      </w:r>
+    </w:p>
+    <w:p>
+      <w:pPr>
+        <w:tabs>
+          <w:tab w:val="left" w:pos="4082"/>
+        </w:tabs>
+        <w:spacing w:before="240" w:after="0" w:line="240" w:lineRule="auto"/>
+        <w:ind w:left="340" w:right="397"/>
+        <w:jc w:val="both"/>
+        <w:rPr>
+          <w:rFonts w:asciiTheme="majorHAnsi" w:hAnsiTheme="majorHAnsi" w:cstheme="majorHAnsi"/>
+          <w:sz w:val="28"/>
+          <w:szCs w:val="28"/>
+          <w:lang w:val="de-DE"/>
+        </w:rPr>
+      </w:pPr>
+      <w:r>
+        <w:rPr>
+          <w:rFonts w:asciiTheme="majorHAnsi" w:hAnsiTheme="majorHAnsi" w:cstheme="majorHAnsi"/>
+          <w:sz w:val="28"/>
+          <w:szCs w:val="28"/>
+          <w:lang w:val="de-DE"/>
+        </w:rPr>
+        <w:t xml:space="preserve">Ich habe bei </w:t>
+      </w:r>
+      <w:proofErr w:type="spellStart"/>
+      <w:r>
+        <w:rPr>
+          <w:rFonts w:asciiTheme="majorHAnsi" w:hAnsiTheme="majorHAnsi" w:cstheme="majorHAnsi"/>
+          <w:sz w:val="28"/>
+          <w:szCs w:val="28"/>
+          <w:lang w:val="de-DE"/>
+        </w:rPr>
+        <w:t>NewHorizon</w:t>
+      </w:r>
+      <w:proofErr w:type="spellEnd"/>
+      <w:r>
+        <w:rPr>
+          <w:rFonts w:asciiTheme="majorHAnsi" w:hAnsiTheme="majorHAnsi" w:cstheme="majorHAnsi"/>
+          <w:sz w:val="28"/>
+          <w:szCs w:val="28"/>
+          <w:lang w:val="de-DE"/>
+        </w:rPr>
+        <w:t xml:space="preserve"> ein Weiterbildungsprogramm im Bereich Cloud &amp; </w:t>
+      </w:r>
+      <w:proofErr w:type="spellStart"/>
+      <w:r>
+        <w:rPr>
+          <w:rFonts w:asciiTheme="majorHAnsi" w:hAnsiTheme="majorHAnsi" w:cstheme="majorHAnsi"/>
+          <w:sz w:val="28"/>
+          <w:szCs w:val="28"/>
+          <w:lang w:val="de-DE"/>
+        </w:rPr>
+        <w:t>DevOps</w:t>
+      </w:r>
+      <w:proofErr w:type="spellEnd"/>
+      <w:r>
+        <w:rPr>
+          <w:rFonts w:asciiTheme="majorHAnsi" w:hAnsiTheme="majorHAnsi" w:cstheme="majorHAnsi"/>
+          <w:sz w:val="28"/>
+          <w:szCs w:val="28"/>
+          <w:lang w:val="de-DE"/>
+        </w:rPr>
+        <w:t xml:space="preserve"> absolviert und verfüge über Zertifizierungen als Azure-Administrator und Azure </w:t>
+      </w:r>
+      <w:proofErr w:type="spellStart"/>
+      <w:r>
+        <w:rPr>
+          <w:rFonts w:asciiTheme="majorHAnsi" w:hAnsiTheme="majorHAnsi" w:cstheme="majorHAnsi"/>
+          <w:sz w:val="28"/>
+          <w:szCs w:val="28"/>
+          <w:lang w:val="de-DE"/>
+        </w:rPr>
+        <w:t>DevOps</w:t>
+      </w:r>
+      <w:proofErr w:type="spellEnd"/>
+      <w:r>
+        <w:rPr>
+          <w:rFonts w:asciiTheme="majorHAnsi" w:hAnsiTheme="majorHAnsi" w:cstheme="majorHAnsi"/>
+          <w:sz w:val="28"/>
+          <w:szCs w:val="28"/>
+          <w:lang w:val="de-DE"/>
+        </w:rPr>
+        <w:t xml:space="preserve"> Engineer Expert. Derzeit beschäftige ich mich intensiv mit AWS und bereite mich auf die Prüfung zum AWS </w:t>
+      </w:r>
+      <w:proofErr w:type="spellStart"/>
+      <w:r>
+        <w:rPr>
+          <w:rFonts w:asciiTheme="majorHAnsi" w:hAnsiTheme="majorHAnsi" w:cstheme="majorHAnsi"/>
+          <w:sz w:val="28"/>
+          <w:szCs w:val="28"/>
+          <w:lang w:val="de-DE"/>
+        </w:rPr>
+        <w:t>DevOps</w:t>
+      </w:r>
+      <w:proofErr w:type="spellEnd"/>
+      <w:r>
+        <w:rPr>
+          <w:rFonts w:asciiTheme="majorHAnsi" w:hAnsiTheme="majorHAnsi" w:cstheme="majorHAnsi"/>
+          <w:sz w:val="28"/>
+          <w:szCs w:val="28"/>
+          <w:lang w:val="de-DE"/>
+        </w:rPr>
+        <w:t xml:space="preserve"> Engineer Professional vor. Ich bin ab sofort verfügbar, um mit Ihnen zu arbeiten.</w:t>
+      </w:r>
+    </w:p>
+    <w:p>
+      <w:pPr>
+        <w:tabs>
+          <w:tab w:val="left" w:pos="4082"/>
+        </w:tabs>
+        <w:spacing w:before="240" w:after="0" w:line="240" w:lineRule="auto"/>
+        <w:ind w:left="340" w:right="397"/>
+        <w:jc w:val="both"/>
+        <w:rPr>
+          <w:rFonts w:asciiTheme="majorHAnsi" w:hAnsiTheme="majorHAnsi" w:cstheme="majorHAnsi"/>
+          <w:sz w:val="28"/>
+          <w:szCs w:val="28"/>
+          <w:lang w:val="de-DE"/>
+        </w:rPr>
+      </w:pPr>
+      <w:r>
+        <w:rPr>
+          <w:rFonts w:asciiTheme="majorHAnsi" w:hAnsiTheme="majorHAnsi" w:cstheme="majorHAnsi"/>
+          <w:sz w:val="28"/>
+          <w:szCs w:val="28"/>
+          <w:lang w:val="de-DE"/>
+        </w:rPr>
+        <w:t>Ich freue mich darauf, in einem persönlichen Gespräch mehr über Ihre Anforderungen zu erfahren und darzulegen, wie ich Ihr Team unterstützen kann. Vielen Dank für Ihre Zeit und Ihr Interesse.</w:t>
+      </w:r>
+    </w:p>
+    <w:p>
+      <w:pPr>
+        <w:tabs>
+          <w:tab w:val="left" w:pos="4082"/>
+        </w:tabs>
+        <w:spacing w:before="240" w:after="0" w:line="240" w:lineRule="auto"/>
+        <w:ind w:left="340" w:right="397"/>
+        <w:jc w:val="both"/>
+        <w:rPr>
+          <w:rFonts w:asciiTheme="majorHAnsi" w:hAnsiTheme="majorHAnsi" w:cstheme="majorHAnsi"/>
+          <w:sz w:val="28"/>
+          <w:szCs w:val="28"/>
+          <w:lang w:val="de-DE"/>
+        </w:rPr>
+      </w:pPr>
+      <w:r>
+        <w:rPr>
+          <w:rFonts w:asciiTheme="majorHAnsi" w:hAnsiTheme="majorHAnsi" w:cstheme="majorHAnsi"/>
+          <w:sz w:val="28"/>
+          <w:szCs w:val="28"/>
+          <w:lang w:val="de-DE"/>
+        </w:rPr>
+        <w:t>Mit freundlichen Grüßen</w:t>
       </w:r>
     </w:p>
     <w:p>
@@ -1002,696 +997,17 @@
         <w:jc w:val="both"/>
         <w:rPr>
           <w:rFonts w:asciiTheme="majorHAnsi" w:hAnsiTheme="majorHAnsi" w:cstheme="majorHAnsi"/>
-          <w:sz w:val="24"/>
-          <w:szCs w:val="24"/>
-        </w:rPr>
-      </w:pPr>
-      <w:r>
-        <w:rPr>
-          <w:rFonts w:asciiTheme="majorHAnsi" w:hAnsiTheme="majorHAnsi" w:cstheme="majorHAnsi"/>
-          <w:sz w:val="24"/>
-          <w:szCs w:val="24"/>
-        </w:rPr>
-        <w:t>A</w:t>
-      </w:r>
-      <w:r>
-        <w:rPr>
-          <w:rFonts w:asciiTheme="majorHAnsi" w:hAnsiTheme="majorHAnsi" w:cstheme="majorHAnsi"/>
-          <w:sz w:val="24"/>
-          <w:szCs w:val="24"/>
-        </w:rPr>
-        <w:t xml:space="preserve">ls </w:t>
-      </w:r>
-      <w:r>
-        <w:rPr>
-          <w:rFonts w:asciiTheme="majorHAnsi" w:hAnsiTheme="majorHAnsi" w:cstheme="majorHAnsi"/>
-          <w:sz w:val="24"/>
-          <w:szCs w:val="24"/>
-        </w:rPr>
-        <w:t xml:space="preserve">Performance </w:t>
-      </w:r>
-      <w:r>
-        <w:rPr>
-          <w:rFonts w:asciiTheme="majorHAnsi" w:hAnsiTheme="majorHAnsi" w:cstheme="majorHAnsi"/>
-          <w:sz w:val="24"/>
-          <w:szCs w:val="24"/>
-        </w:rPr>
-        <w:t xml:space="preserve">ingenieur </w:t>
-      </w:r>
-      <w:r>
-        <w:rPr>
-          <w:rFonts w:asciiTheme="majorHAnsi" w:hAnsiTheme="majorHAnsi" w:cstheme="majorHAnsi"/>
-          <w:sz w:val="24"/>
-          <w:szCs w:val="24"/>
-        </w:rPr>
-        <w:t xml:space="preserve">habe </w:t>
-      </w:r>
-      <w:r>
-        <w:rPr>
-          <w:rFonts w:asciiTheme="majorHAnsi" w:hAnsiTheme="majorHAnsi" w:cstheme="majorHAnsi"/>
-          <w:sz w:val="24"/>
-          <w:szCs w:val="24"/>
-        </w:rPr>
-        <w:t xml:space="preserve">ich </w:t>
-      </w:r>
-      <w:r>
-        <w:rPr>
-          <w:rFonts w:asciiTheme="majorHAnsi" w:hAnsiTheme="majorHAnsi" w:cstheme="majorHAnsi"/>
-          <w:sz w:val="24"/>
-          <w:szCs w:val="24"/>
-        </w:rPr>
-        <w:t>Erfahrung in der Fehlersuche und Ursachenanalyse von Fehlern in Lagersystemen</w:t>
-      </w:r>
-      <w:r>
-        <w:rPr>
-          <w:rFonts w:asciiTheme="majorHAnsi" w:hAnsiTheme="majorHAnsi" w:cstheme="majorHAnsi"/>
-          <w:sz w:val="24"/>
-          <w:szCs w:val="24"/>
-        </w:rPr>
-        <w:t xml:space="preserve">. Ich habe </w:t>
-      </w:r>
-      <w:r>
-        <w:rPr>
-          <w:rFonts w:asciiTheme="majorHAnsi" w:hAnsiTheme="majorHAnsi" w:cstheme="majorHAnsi"/>
-          <w:sz w:val="24"/>
-          <w:szCs w:val="24"/>
-        </w:rPr>
-        <w:t>an</w:t>
-      </w:r>
-      <w:r>
-        <w:rPr>
-          <w:rFonts w:asciiTheme="majorHAnsi" w:hAnsiTheme="majorHAnsi" w:cstheme="majorHAnsi"/>
-          <w:sz w:val="24"/>
-          <w:szCs w:val="24"/>
-        </w:rPr>
-        <w:t xml:space="preserve"> Postgresql, </w:t>
-      </w:r>
-      <w:r>
-        <w:rPr>
-          <w:rFonts w:asciiTheme="majorHAnsi" w:hAnsiTheme="majorHAnsi" w:cstheme="majorHAnsi"/>
-          <w:sz w:val="24"/>
-          <w:szCs w:val="24"/>
-        </w:rPr>
-        <w:t xml:space="preserve">Linux, C++, </w:t>
-      </w:r>
-      <w:r>
-        <w:rPr>
-          <w:rFonts w:asciiTheme="majorHAnsi" w:hAnsiTheme="majorHAnsi" w:cstheme="majorHAnsi"/>
-          <w:sz w:val="24"/>
-          <w:szCs w:val="24"/>
-        </w:rPr>
-        <w:t>Power shell</w:t>
-      </w:r>
-      <w:r>
-        <w:rPr>
-          <w:rFonts w:asciiTheme="majorHAnsi" w:hAnsiTheme="majorHAnsi" w:cstheme="majorHAnsi"/>
-          <w:sz w:val="24"/>
-          <w:szCs w:val="24"/>
-        </w:rPr>
-        <w:t xml:space="preserve">, </w:t>
-      </w:r>
-      <w:r>
-        <w:rPr>
-          <w:rFonts w:asciiTheme="majorHAnsi" w:hAnsiTheme="majorHAnsi" w:cstheme="majorHAnsi"/>
-          <w:sz w:val="24"/>
-          <w:szCs w:val="24"/>
-        </w:rPr>
-        <w:t xml:space="preserve">Grafana, </w:t>
-      </w:r>
-      <w:r>
-        <w:rPr>
-          <w:rFonts w:asciiTheme="majorHAnsi" w:hAnsiTheme="majorHAnsi" w:cstheme="majorHAnsi"/>
-          <w:sz w:val="24"/>
-          <w:szCs w:val="24"/>
-        </w:rPr>
-        <w:t xml:space="preserve">Azure, </w:t>
-      </w:r>
-      <w:r>
-        <w:rPr>
-          <w:rFonts w:asciiTheme="majorHAnsi" w:hAnsiTheme="majorHAnsi" w:cstheme="majorHAnsi"/>
-          <w:sz w:val="24"/>
-          <w:szCs w:val="24"/>
-        </w:rPr>
-        <w:t>Gitlab, Docker</w:t>
-      </w:r>
-      <w:r>
-        <w:rPr>
-          <w:rFonts w:asciiTheme="majorHAnsi" w:hAnsiTheme="majorHAnsi" w:cstheme="majorHAnsi"/>
-          <w:sz w:val="24"/>
-          <w:szCs w:val="24"/>
-        </w:rPr>
-        <w:t xml:space="preserve"> und </w:t>
-      </w:r>
-      <w:r>
-        <w:rPr>
-          <w:rFonts w:asciiTheme="majorHAnsi" w:hAnsiTheme="majorHAnsi" w:cstheme="majorHAnsi"/>
-          <w:sz w:val="24"/>
-          <w:szCs w:val="24"/>
-        </w:rPr>
-        <w:t xml:space="preserve">REST </w:t>
-      </w:r>
-      <w:r>
-        <w:rPr>
-          <w:rFonts w:asciiTheme="majorHAnsi" w:hAnsiTheme="majorHAnsi" w:cstheme="majorHAnsi"/>
-          <w:sz w:val="24"/>
-          <w:szCs w:val="24"/>
-        </w:rPr>
-        <w:t>APIs gearbeitet.</w:t>
-      </w:r>
-      <w:r>
-        <w:rPr>
-          <w:rFonts w:asciiTheme="majorHAnsi" w:hAnsiTheme="majorHAnsi" w:cstheme="majorHAnsi"/>
-          <w:sz w:val="24"/>
-          <w:szCs w:val="24"/>
-        </w:rPr>
-        <w:t xml:space="preserve"> </w:t>
-      </w:r>
-      <w:r>
-        <w:rPr>
-          <w:rFonts w:asciiTheme="majorHAnsi" w:hAnsiTheme="majorHAnsi" w:cstheme="majorHAnsi"/>
-          <w:sz w:val="24"/>
-          <w:szCs w:val="24"/>
-        </w:rPr>
-        <w:t>Ich habe Erfahrung im</w:t>
-      </w:r>
-      <w:r>
-        <w:rPr>
-          <w:rFonts w:asciiTheme="majorHAnsi" w:hAnsiTheme="majorHAnsi" w:cstheme="majorHAnsi"/>
-          <w:sz w:val="24"/>
-          <w:szCs w:val="24"/>
-        </w:rPr>
-        <w:t xml:space="preserve"> </w:t>
-      </w:r>
-      <w:r>
-        <w:rPr>
-          <w:rFonts w:asciiTheme="majorHAnsi" w:hAnsiTheme="majorHAnsi" w:cstheme="majorHAnsi"/>
-          <w:sz w:val="24"/>
-          <w:szCs w:val="24"/>
-        </w:rPr>
-        <w:t>Systemoptimierung und Verbesserung der KPIs des Robotiksystems, Fehlerbehebung und Ursachenanalyse, Bereitstellung der neuen Software auf dem Produktionsserver, Erstellung eines Plans zur Performance-Verbesserung, CAPA und Postmortem-Aufgaben nach dem Ausfall, Optimierung der SQL-Abfragen und Überwachung der Performance von Datenbankservern</w:t>
-      </w:r>
-      <w:r>
-        <w:rPr>
-          <w:rFonts w:asciiTheme="majorHAnsi" w:hAnsiTheme="majorHAnsi" w:cstheme="majorHAnsi"/>
-          <w:sz w:val="24"/>
-          <w:szCs w:val="24"/>
-        </w:rPr>
-        <w:t xml:space="preserve">. </w:t>
-      </w:r>
-      <w:r>
-        <w:rPr>
-          <w:rFonts w:asciiTheme="majorHAnsi" w:hAnsiTheme="majorHAnsi" w:cstheme="majorHAnsi"/>
-          <w:sz w:val="24"/>
-          <w:szCs w:val="24"/>
-        </w:rPr>
-        <w:t>Ich habe mein Masterstudium in eingebettetes Systems an der TU Chemnitz abgeschlossen. Ich habe meine Abschlussarbeit bei Robert Bosch GmbH gemacht. Das Thema ist „Erkennung und Behandlung von Mehrwegeausbreitung bei der Radarobjektverfolgung”. Früher habe ich als Praktikant bei Robert Bosch GmbH gearbeitet. Ich habe einen Algorithmus zur Identifizierung von G</w:t>
-      </w:r>
-      <w:r>
-        <w:rPr>
-          <w:rFonts w:asciiTheme="majorHAnsi" w:hAnsiTheme="majorHAnsi" w:cstheme="majorHAnsi"/>
-          <w:sz w:val="24"/>
-          <w:szCs w:val="24"/>
-        </w:rPr>
-        <w:t>host</w:t>
-      </w:r>
-      <w:r>
-        <w:rPr>
-          <w:rFonts w:asciiTheme="majorHAnsi" w:hAnsiTheme="majorHAnsi" w:cstheme="majorHAnsi"/>
-          <w:sz w:val="24"/>
-          <w:szCs w:val="24"/>
-        </w:rPr>
-        <w:t xml:space="preserve">objekten und ihrer entsprechenden reflektierenden Oberfläche und des realen Objekts </w:t>
-      </w:r>
-      <w:r>
-        <w:rPr>
-          <w:rFonts w:asciiTheme="majorHAnsi" w:hAnsiTheme="majorHAnsi" w:cstheme="majorHAnsi"/>
-          <w:sz w:val="24"/>
-          <w:szCs w:val="24"/>
-        </w:rPr>
-        <w:t xml:space="preserve">in MATLAB </w:t>
-      </w:r>
-      <w:r>
-        <w:rPr>
-          <w:rFonts w:asciiTheme="majorHAnsi" w:hAnsiTheme="majorHAnsi" w:cstheme="majorHAnsi"/>
-          <w:sz w:val="24"/>
-          <w:szCs w:val="24"/>
-        </w:rPr>
-        <w:t xml:space="preserve">entwickelt. </w:t>
-      </w:r>
-      <w:r>
-        <w:rPr>
-          <w:rFonts w:asciiTheme="majorHAnsi" w:hAnsiTheme="majorHAnsi" w:cstheme="majorHAnsi"/>
-          <w:sz w:val="24"/>
-          <w:szCs w:val="24"/>
-        </w:rPr>
-        <w:t>Die Zuverlässigkeit des Modells wird durch die Schätzung der Wahrscheinlichkeit mit probabilistischen Schätzungsmethoden erreicht.</w:t>
-      </w:r>
-    </w:p>
-    <w:p>
-      <w:pPr>
-        <w:tabs>
-          <w:tab w:val="left" w:pos="4082"/>
-        </w:tabs>
-        <w:spacing w:line="240" w:lineRule="auto"/>
-        <w:ind w:left="340" w:right="397"/>
-        <w:jc w:val="both"/>
-        <w:rPr>
-          <w:rFonts w:asciiTheme="majorHAnsi" w:hAnsiTheme="majorHAnsi" w:cstheme="majorHAnsi"/>
-          <w:sz w:val="24"/>
-          <w:szCs w:val="24"/>
-        </w:rPr>
-      </w:pPr>
-      <w:r>
-        <w:rPr>
-          <w:rFonts w:asciiTheme="majorHAnsi" w:hAnsiTheme="majorHAnsi" w:cstheme="majorHAnsi"/>
-          <w:sz w:val="24"/>
-          <w:szCs w:val="24"/>
-        </w:rPr>
-        <w:t xml:space="preserve">Während meiner </w:t>
-      </w:r>
-      <w:r>
-        <w:rPr>
-          <w:rFonts w:asciiTheme="majorHAnsi" w:hAnsiTheme="majorHAnsi" w:cstheme="majorHAnsi"/>
-          <w:sz w:val="24"/>
-          <w:szCs w:val="24"/>
-        </w:rPr>
-        <w:t>5 Jahre</w:t>
-      </w:r>
-      <w:r>
-        <w:rPr>
-          <w:rFonts w:asciiTheme="majorHAnsi" w:hAnsiTheme="majorHAnsi" w:cstheme="majorHAnsi"/>
-          <w:sz w:val="24"/>
-          <w:szCs w:val="24"/>
-        </w:rPr>
-        <w:t xml:space="preserve"> Erfahrung bei Tata Consultancy Services habe ich gute Kenntnisse in </w:t>
-      </w:r>
-      <w:r>
-        <w:rPr>
-          <w:rFonts w:asciiTheme="majorHAnsi" w:hAnsiTheme="majorHAnsi" w:cstheme="majorHAnsi"/>
-          <w:sz w:val="24"/>
-          <w:szCs w:val="24"/>
-        </w:rPr>
-        <w:t xml:space="preserve">DevOps-Prinzip tools </w:t>
-      </w:r>
-      <w:r>
-        <w:rPr>
-          <w:rFonts w:asciiTheme="majorHAnsi" w:hAnsiTheme="majorHAnsi" w:cstheme="majorHAnsi"/>
-          <w:sz w:val="24"/>
-          <w:szCs w:val="24"/>
-        </w:rPr>
-        <w:t>wie</w:t>
-      </w:r>
-      <w:r>
-        <w:rPr>
-          <w:rFonts w:asciiTheme="majorHAnsi" w:hAnsiTheme="majorHAnsi" w:cstheme="majorHAnsi"/>
-          <w:sz w:val="24"/>
-          <w:szCs w:val="24"/>
-        </w:rPr>
-        <w:t xml:space="preserve"> Jenkins, GitHub, Visual Studio, </w:t>
-      </w:r>
-      <w:r>
-        <w:rPr>
-          <w:rFonts w:asciiTheme="majorHAnsi" w:hAnsiTheme="majorHAnsi" w:cstheme="majorHAnsi"/>
-          <w:sz w:val="24"/>
-          <w:szCs w:val="24"/>
-        </w:rPr>
-        <w:t xml:space="preserve">Jira, </w:t>
-      </w:r>
-      <w:r>
-        <w:rPr>
-          <w:rFonts w:asciiTheme="majorHAnsi" w:hAnsiTheme="majorHAnsi" w:cstheme="majorHAnsi"/>
-          <w:sz w:val="24"/>
-          <w:szCs w:val="24"/>
-        </w:rPr>
-        <w:t>ServiceNow, Splunk, Dynatrace, Prometheus, IBM Websphere MQ and MB, Putty, Winscp, IBM DB2</w:t>
-      </w:r>
-      <w:r>
-        <w:rPr>
-          <w:rFonts w:asciiTheme="majorHAnsi" w:hAnsiTheme="majorHAnsi" w:cstheme="majorHAnsi"/>
-          <w:sz w:val="24"/>
-          <w:szCs w:val="24"/>
-        </w:rPr>
-        <w:t xml:space="preserve"> </w:t>
-      </w:r>
-      <w:r>
-        <w:rPr>
-          <w:rFonts w:asciiTheme="majorHAnsi" w:hAnsiTheme="majorHAnsi" w:cstheme="majorHAnsi"/>
-          <w:sz w:val="24"/>
-          <w:szCs w:val="24"/>
-        </w:rPr>
-        <w:t>erworben.</w:t>
-      </w:r>
-      <w:r>
-        <w:rPr>
-          <w:rFonts w:asciiTheme="majorHAnsi" w:hAnsiTheme="majorHAnsi" w:cstheme="majorHAnsi"/>
-          <w:sz w:val="24"/>
-          <w:szCs w:val="24"/>
-        </w:rPr>
-        <w:t xml:space="preserve"> </w:t>
-      </w:r>
-      <w:r>
-        <w:rPr>
-          <w:rFonts w:asciiTheme="majorHAnsi" w:hAnsiTheme="majorHAnsi" w:cstheme="majorHAnsi"/>
-          <w:sz w:val="24"/>
-          <w:szCs w:val="24"/>
-        </w:rPr>
-        <w:t>Als Systemingenieur habe ich an JavaScript Anwendungen mit MVC-</w:t>
-      </w:r>
-      <w:r>
-        <w:rPr>
-          <w:rFonts w:asciiTheme="majorHAnsi" w:hAnsiTheme="majorHAnsi" w:cstheme="majorHAnsi"/>
-          <w:sz w:val="24"/>
-          <w:szCs w:val="24"/>
-        </w:rPr>
-        <w:t xml:space="preserve"> </w:t>
-      </w:r>
-      <w:r>
-        <w:rPr>
-          <w:rFonts w:asciiTheme="majorHAnsi" w:hAnsiTheme="majorHAnsi" w:cstheme="majorHAnsi"/>
-          <w:sz w:val="24"/>
-          <w:szCs w:val="24"/>
-        </w:rPr>
-        <w:t xml:space="preserve">Architektur, Spring Framework und </w:t>
-      </w:r>
-      <w:r>
-        <w:rPr>
-          <w:rFonts w:asciiTheme="majorHAnsi" w:hAnsiTheme="majorHAnsi" w:cstheme="majorHAnsi"/>
-          <w:sz w:val="24"/>
-          <w:szCs w:val="24"/>
-        </w:rPr>
-        <w:t>Hibernate</w:t>
-      </w:r>
-      <w:r>
-        <w:rPr>
-          <w:rFonts w:asciiTheme="majorHAnsi" w:hAnsiTheme="majorHAnsi" w:cstheme="majorHAnsi"/>
-          <w:sz w:val="24"/>
-          <w:szCs w:val="24"/>
-        </w:rPr>
-        <w:t xml:space="preserve"> gearbeitet.</w:t>
-      </w:r>
-      <w:r>
-        <w:rPr>
-          <w:rFonts w:asciiTheme="majorHAnsi" w:hAnsiTheme="majorHAnsi" w:cstheme="majorHAnsi"/>
-          <w:sz w:val="24"/>
-          <w:szCs w:val="24"/>
-        </w:rPr>
-        <w:t xml:space="preserve"> </w:t>
-      </w:r>
-      <w:r>
-        <w:rPr>
-          <w:rFonts w:asciiTheme="majorHAnsi" w:hAnsiTheme="majorHAnsi" w:cstheme="majorHAnsi"/>
-          <w:sz w:val="24"/>
-          <w:szCs w:val="24"/>
-        </w:rPr>
-        <w:t xml:space="preserve">Meine Aufgabe bestand darin, </w:t>
-      </w:r>
-      <w:r>
-        <w:rPr>
-          <w:rFonts w:asciiTheme="majorHAnsi" w:hAnsiTheme="majorHAnsi" w:cstheme="majorHAnsi"/>
-          <w:sz w:val="24"/>
-          <w:szCs w:val="24"/>
-        </w:rPr>
-        <w:t>v</w:t>
-      </w:r>
-      <w:r>
-        <w:rPr>
-          <w:rFonts w:asciiTheme="majorHAnsi" w:hAnsiTheme="majorHAnsi" w:cstheme="majorHAnsi"/>
-          <w:sz w:val="24"/>
-          <w:szCs w:val="24"/>
-        </w:rPr>
-        <w:t>erwaltung der CI/CD-Pipeline, Code-Reviews</w:t>
-      </w:r>
-      <w:r>
-        <w:rPr>
-          <w:rFonts w:asciiTheme="majorHAnsi" w:hAnsiTheme="majorHAnsi" w:cstheme="majorHAnsi"/>
-          <w:sz w:val="24"/>
-          <w:szCs w:val="24"/>
-        </w:rPr>
-        <w:t>, Testen neu softwaren, Anwendungen überwachung, verwaltung von releases, hotfixes und Infrastruktur.</w:t>
-      </w:r>
-    </w:p>
-    <w:p>
-      <w:pPr>
-        <w:tabs>
-          <w:tab w:val="left" w:pos="4082"/>
-        </w:tabs>
-        <w:spacing w:line="240" w:lineRule="auto"/>
-        <w:ind w:left="340" w:right="397"/>
-        <w:jc w:val="both"/>
-        <w:rPr>
-          <w:rFonts w:asciiTheme="majorHAnsi" w:hAnsiTheme="majorHAnsi" w:cstheme="majorHAnsi"/>
-          <w:sz w:val="24"/>
-          <w:szCs w:val="24"/>
-        </w:rPr>
-      </w:pPr>
-      <w:r>
-        <w:rPr>
-          <w:rFonts w:asciiTheme="majorHAnsi" w:hAnsiTheme="majorHAnsi" w:cstheme="majorHAnsi"/>
-          <w:sz w:val="24"/>
-          <w:szCs w:val="24"/>
-        </w:rPr>
-        <w:t>Ich verfüge über gute Organisations- und Projektmanagementfähigkeiten, einschließlich Prioritätensetzung</w:t>
-      </w:r>
-      <w:r>
-        <w:rPr>
-          <w:rFonts w:asciiTheme="majorHAnsi" w:hAnsiTheme="majorHAnsi" w:cstheme="majorHAnsi"/>
-          <w:sz w:val="24"/>
-          <w:szCs w:val="24"/>
-        </w:rPr>
-        <w:t xml:space="preserve"> </w:t>
-      </w:r>
-      <w:r>
-        <w:rPr>
-          <w:rFonts w:asciiTheme="majorHAnsi" w:hAnsiTheme="majorHAnsi" w:cstheme="majorHAnsi"/>
-          <w:sz w:val="24"/>
-          <w:szCs w:val="24"/>
-        </w:rPr>
-        <w:t>und Zeitmanagement. Außerdem bin ich ein guter Teamplayer und ein sehr engagierter Mensch, was sich in meinen durchweg guten Leistungen von der High School bis zu meinem Masterstudium zeigt.</w:t>
-      </w:r>
-    </w:p>
-    <w:p>
-      <w:pPr>
-        <w:tabs>
-          <w:tab w:val="left" w:pos="4082"/>
-        </w:tabs>
-        <w:spacing w:line="240" w:lineRule="auto"/>
-        <w:ind w:left="340" w:right="397"/>
-        <w:jc w:val="both"/>
-        <w:rPr>
-          <w:rFonts w:asciiTheme="majorHAnsi" w:hAnsiTheme="majorHAnsi" w:cstheme="majorHAnsi"/>
-          <w:sz w:val="24"/>
-          <w:szCs w:val="24"/>
-        </w:rPr>
-      </w:pPr>
-      <w:r>
-        <w:rPr>
-          <w:rFonts w:asciiTheme="majorHAnsi" w:hAnsiTheme="majorHAnsi" w:cstheme="majorHAnsi"/>
-          <w:sz w:val="24"/>
-          <w:szCs w:val="24"/>
-        </w:rPr>
-        <w:t xml:space="preserve">Ich </w:t>
-      </w:r>
-      <w:r>
-        <w:rPr>
-          <w:rFonts w:asciiTheme="majorHAnsi" w:hAnsiTheme="majorHAnsi" w:cstheme="majorHAnsi"/>
-          <w:sz w:val="24"/>
-          <w:szCs w:val="24"/>
-        </w:rPr>
-        <w:t>war in</w:t>
-      </w:r>
-      <w:r>
-        <w:rPr>
-          <w:rFonts w:asciiTheme="majorHAnsi" w:hAnsiTheme="majorHAnsi" w:cstheme="majorHAnsi"/>
-          <w:sz w:val="24"/>
-          <w:szCs w:val="24"/>
-        </w:rPr>
-        <w:t xml:space="preserve"> eine berufliche Pause bis </w:t>
-      </w:r>
-      <w:r>
-        <w:rPr>
-          <w:rFonts w:asciiTheme="majorHAnsi" w:hAnsiTheme="majorHAnsi" w:cstheme="majorHAnsi"/>
-          <w:sz w:val="24"/>
-          <w:szCs w:val="24"/>
-        </w:rPr>
-        <w:t>Oct</w:t>
-      </w:r>
-      <w:r>
-        <w:rPr>
-          <w:rFonts w:asciiTheme="majorHAnsi" w:hAnsiTheme="majorHAnsi" w:cstheme="majorHAnsi"/>
-          <w:sz w:val="24"/>
-          <w:szCs w:val="24"/>
-        </w:rPr>
-        <w:t xml:space="preserve"> 2025</w:t>
-      </w:r>
-      <w:r>
-        <w:rPr>
-          <w:rFonts w:asciiTheme="majorHAnsi" w:hAnsiTheme="majorHAnsi" w:cstheme="majorHAnsi"/>
-          <w:sz w:val="24"/>
-          <w:szCs w:val="24"/>
-        </w:rPr>
-        <w:t xml:space="preserve"> gemacht</w:t>
-      </w:r>
-      <w:r>
-        <w:rPr>
-          <w:rFonts w:asciiTheme="majorHAnsi" w:hAnsiTheme="majorHAnsi" w:cstheme="majorHAnsi"/>
-          <w:sz w:val="24"/>
-          <w:szCs w:val="24"/>
-        </w:rPr>
-        <w:t>, um mich um meine 1-jährige Tochter zu kümmern.</w:t>
-      </w:r>
-      <w:r>
-        <w:rPr>
-          <w:rFonts w:asciiTheme="majorHAnsi" w:hAnsiTheme="majorHAnsi" w:cstheme="majorHAnsi"/>
-          <w:sz w:val="24"/>
-          <w:szCs w:val="24"/>
-        </w:rPr>
-        <w:t xml:space="preserve"> </w:t>
-      </w:r>
-      <w:r>
-        <w:rPr>
-          <w:rFonts w:asciiTheme="majorHAnsi" w:hAnsiTheme="majorHAnsi" w:cstheme="majorHAnsi"/>
-          <w:sz w:val="24"/>
-          <w:szCs w:val="24"/>
-        </w:rPr>
-        <w:t xml:space="preserve">Jetzt mache ich Weiterbildungen bei NewHorizon in Cloud und DevOps bis </w:t>
-      </w:r>
-      <w:r>
-        <w:rPr>
-          <w:rFonts w:asciiTheme="majorHAnsi" w:hAnsiTheme="majorHAnsi" w:cstheme="majorHAnsi"/>
-          <w:sz w:val="24"/>
-          <w:szCs w:val="24"/>
-        </w:rPr>
-        <w:t>März</w:t>
-      </w:r>
-      <w:r>
-        <w:rPr>
-          <w:rFonts w:asciiTheme="majorHAnsi" w:hAnsiTheme="majorHAnsi" w:cstheme="majorHAnsi"/>
-          <w:sz w:val="24"/>
-          <w:szCs w:val="24"/>
-        </w:rPr>
-        <w:t xml:space="preserve"> 2026. </w:t>
-      </w:r>
-      <w:r>
-        <w:rPr>
-          <w:rFonts w:asciiTheme="majorHAnsi" w:hAnsiTheme="majorHAnsi" w:cstheme="majorHAnsi"/>
-          <w:sz w:val="24"/>
-          <w:szCs w:val="24"/>
-        </w:rPr>
-        <w:t xml:space="preserve">Ich bin </w:t>
-      </w:r>
-      <w:r>
-        <w:rPr>
-          <w:rFonts w:asciiTheme="majorHAnsi" w:hAnsiTheme="majorHAnsi" w:cstheme="majorHAnsi"/>
-          <w:sz w:val="24"/>
-          <w:szCs w:val="24"/>
-        </w:rPr>
-        <w:t>ab April verfügbar</w:t>
-      </w:r>
-      <w:r>
-        <w:rPr>
-          <w:rFonts w:asciiTheme="majorHAnsi" w:hAnsiTheme="majorHAnsi" w:cstheme="majorHAnsi"/>
-          <w:sz w:val="24"/>
-          <w:szCs w:val="24"/>
-        </w:rPr>
-        <w:t>.</w:t>
-      </w:r>
-      <w:r>
-        <w:rPr>
-          <w:rFonts w:asciiTheme="majorHAnsi" w:hAnsiTheme="majorHAnsi" w:cstheme="majorHAnsi"/>
-          <w:sz w:val="24"/>
-          <w:szCs w:val="24"/>
-        </w:rPr>
-        <w:t xml:space="preserve"> </w:t>
-      </w:r>
-      <w:r>
-        <w:rPr>
-          <w:rFonts w:asciiTheme="majorHAnsi" w:hAnsiTheme="majorHAnsi" w:cstheme="majorHAnsi"/>
-          <w:sz w:val="24"/>
-          <w:szCs w:val="24"/>
-        </w:rPr>
-        <w:t xml:space="preserve">Ich würde gerne mehr über die </w:t>
-      </w:r>
-      <w:r>
-        <w:rPr>
-          <w:rFonts w:asciiTheme="majorHAnsi" w:hAnsiTheme="majorHAnsi" w:cstheme="majorHAnsi"/>
-          <w:sz w:val="24"/>
-          <w:szCs w:val="24"/>
-        </w:rPr>
-        <w:t>Möglichkeit</w:t>
-      </w:r>
-      <w:r>
-        <w:rPr>
-          <w:rFonts w:asciiTheme="majorHAnsi" w:hAnsiTheme="majorHAnsi" w:cstheme="majorHAnsi"/>
-          <w:sz w:val="24"/>
-          <w:szCs w:val="24"/>
-        </w:rPr>
-        <w:t xml:space="preserve"> und Ihre Technologie erfahren</w:t>
-      </w:r>
-      <w:r>
-        <w:rPr>
-          <w:rFonts w:asciiTheme="majorHAnsi" w:hAnsiTheme="majorHAnsi" w:cstheme="majorHAnsi"/>
-          <w:sz w:val="24"/>
-          <w:szCs w:val="24"/>
-        </w:rPr>
-        <w:t>.</w:t>
-      </w:r>
-      <w:r>
-        <w:rPr>
-          <w:rFonts w:asciiTheme="majorHAnsi" w:hAnsiTheme="majorHAnsi" w:cstheme="majorHAnsi"/>
-          <w:sz w:val="24"/>
-          <w:szCs w:val="24"/>
-        </w:rPr>
-        <w:t xml:space="preserve"> </w:t>
-      </w:r>
-      <w:r>
-        <w:rPr>
-          <w:rFonts w:asciiTheme="majorHAnsi" w:hAnsiTheme="majorHAnsi" w:cstheme="majorHAnsi"/>
-          <w:sz w:val="24"/>
-          <w:szCs w:val="24"/>
-        </w:rPr>
-        <w:t>Ich danke Ihnen für Ihre Zeit und Ihre Aufmerksamkeit. Ich freue mich darauf, zu einem Vorstellungsgespräch eingeladen zu werden.</w:t>
-      </w:r>
-    </w:p>
-    <w:p>
-      <w:pPr>
-        <w:tabs>
-          <w:tab w:val="left" w:pos="4082"/>
-        </w:tabs>
-        <w:spacing w:before="240" w:after="0" w:line="240" w:lineRule="auto"/>
-        <w:ind w:left="340" w:right="397"/>
-        <w:rPr>
-          <w:rFonts w:asciiTheme="majorHAnsi" w:hAnsiTheme="majorHAnsi" w:cstheme="majorHAnsi"/>
-          <w:sz w:val="24"/>
-          <w:szCs w:val="24"/>
-        </w:rPr>
-      </w:pPr>
-      <w:r>
-        <w:rPr>
-          <w:rFonts w:asciiTheme="majorHAnsi" w:hAnsiTheme="majorHAnsi" w:cstheme="majorHAnsi"/>
-          <w:sz w:val="24"/>
-          <w:szCs w:val="24"/>
-        </w:rPr>
-        <w:t>Mit freundlichen Grüßen</w:t>
-      </w:r>
-    </w:p>
-    <w:p>
-      <w:pPr>
-        <w:tabs>
-          <w:tab w:val="left" w:pos="4082"/>
-        </w:tabs>
-        <w:spacing w:line="240" w:lineRule="auto"/>
-        <w:ind w:left="340" w:right="397"/>
-        <w:rPr>
-          <w:rFonts w:asciiTheme="majorHAnsi" w:hAnsiTheme="majorHAnsi" w:cstheme="majorHAnsi"/>
-          <w:sz w:val="24"/>
-          <w:szCs w:val="24"/>
-        </w:rPr>
-      </w:pPr>
-      <w:r>
-        <w:rPr>
-          <w:rFonts w:asciiTheme="majorHAnsi" w:hAnsiTheme="majorHAnsi" w:cstheme="majorHAnsi"/>
-          <w:sz w:val="24"/>
-          <w:szCs w:val="24"/>
+          <w:sz w:val="28"/>
+          <w:szCs w:val="28"/>
+          <w:lang w:val="de-DE"/>
+        </w:rPr>
+      </w:pPr>
+      <w:r>
+        <w:rPr>
+          <w:rFonts w:asciiTheme="majorHAnsi" w:hAnsiTheme="majorHAnsi" w:cstheme="majorHAnsi"/>
+          <w:sz w:val="28"/>
+          <w:szCs w:val="28"/>
+          <w:lang w:val="de-DE"/>
         </w:rPr>
         <w:t>Vignesh Sundaramahalingam</w:t>
       </w:r>
@@ -2999,6 +2315,7 @@
   <w:style w:type="character" w:default="1" w:styleId="DefaultParagraphFont">
     <w:name w:val="Default Paragraph Font"/>
     <w:uiPriority w:val="1"/>
+    <w:semiHidden/>
     <w:unhideWhenUsed/>
   </w:style>
   <w:style w:type="table" w:default="1" w:styleId="TableNormal">

</xml_diff>